<commit_message>
feat: finops engine verified
</commit_message>
<xml_diff>
--- a/docs/Vesper_V1_Implementation_Plan.docx
+++ b/docs/Vesper_V1_Implementation_Plan.docx
@@ -3470,6 +3470,121 @@
           <w:color w:val="2B579A"/>
           <w:sz w:val="28"/>
         </w:rPr>
+        <w:t>Manifest versioning &amp; the V1 gate</w:t>
+      </w:r>
+    </w:p>
+    <w:p>
+      <w:r>
+        <w:rPr>
+          <w:b/>
+          <w:i w:val="0"/>
+        </w:rPr>
+        <w:t xml:space="preserve">apiVersion is the real gate for what a release supports. </w:t>
+      </w:r>
+      <w:r>
+        <w:rPr>
+          <w:b w:val="0"/>
+          <w:i w:val="0"/>
+        </w:rPr>
+        <w:t xml:space="preserve">The V1 schema knows a single kind — </w:t>
+      </w:r>
+      <w:r>
+        <w:rPr>
+          <w:rFonts w:ascii="Consolas" w:hAnsi="Consolas"/>
+          <w:b w:val="0"/>
+          <w:i w:val="0"/>
+          <w:color w:val="1E3E6E"/>
+          <w:sz w:val="19"/>
+        </w:rPr>
+        <w:t>Agent</w:t>
+      </w:r>
+      <w:r>
+        <w:rPr>
+          <w:b w:val="0"/>
+          <w:i w:val="0"/>
+        </w:rPr>
+        <w:t xml:space="preserve"> under </w:t>
+      </w:r>
+      <w:r>
+        <w:rPr>
+          <w:rFonts w:ascii="Consolas" w:hAnsi="Consolas"/>
+          <w:b w:val="0"/>
+          <w:i w:val="0"/>
+          <w:color w:val="1E3E6E"/>
+          <w:sz w:val="19"/>
+        </w:rPr>
+        <w:t>apiVersion: vesper/v1</w:t>
+      </w:r>
+      <w:r>
+        <w:rPr>
+          <w:b w:val="0"/>
+          <w:i w:val="0"/>
+        </w:rPr>
+        <w:t>. Anything not built for V1 is removed from the schema, not merely ignored.</w:t>
+      </w:r>
+    </w:p>
+    <w:p>
+      <w:pPr>
+        <w:pStyle w:val="ListBullet"/>
+        <w:spacing w:after="60"/>
+      </w:pPr>
+      <w:r>
+        <w:rPr>
+          <w:b w:val="0"/>
+          <w:i w:val="0"/>
+        </w:rPr>
+        <w:t>StrictBaseModel uses extra="forbid", so a manifest carrying a parked field (guardrails, eval, ...) fails validation with a clear "not permitted" error.</w:t>
+      </w:r>
+    </w:p>
+    <w:p>
+      <w:pPr>
+        <w:pStyle w:val="ListBullet"/>
+        <w:spacing w:after="60"/>
+      </w:pPr>
+      <w:r>
+        <w:rPr>
+          <w:rFonts w:ascii="Consolas" w:hAnsi="Consolas"/>
+          <w:b w:val="0"/>
+          <w:i w:val="0"/>
+          <w:color w:val="1E3E6E"/>
+          <w:sz w:val="19"/>
+        </w:rPr>
+        <w:t>kind: AgentFleet</w:t>
+      </w:r>
+      <w:r>
+        <w:rPr>
+          <w:b w:val="0"/>
+          <w:i w:val="0"/>
+        </w:rPr>
+        <w:t xml:space="preserve"> is caught early in validate_manifest and rejected with a friendly "not supported in vesper/v1, planned for a future release" message.</w:t>
+      </w:r>
+    </w:p>
+    <w:p>
+      <w:pPr>
+        <w:pStyle w:val="ListBullet"/>
+        <w:spacing w:after="60"/>
+      </w:pPr>
+      <w:r>
+        <w:rPr>
+          <w:b w:val="0"/>
+          <w:i w:val="0"/>
+        </w:rPr>
+        <w:t>Forward path: v2 re-introduces AgentFleetManifest and widens the type adapter under apiVersion: vesper/v2; existing vesper/v1 single-agent manifests keep working unchanged.</w:t>
+      </w:r>
+    </w:p>
+    <w:p>
+      <w:pPr>
+        <w:spacing w:before="280" w:after="80"/>
+        <w:pBdr>
+          <w:bottom w:val="single" w:sz="6" w:space="3" w:color="D0D4DA"/>
+        </w:pBdr>
+      </w:pPr>
+      <w:r>
+        <w:rPr>
+          <w:b/>
+          <w:color w:val="2B579A"/>
+          <w:sz w:val="28"/>
+        </w:rPr>
         <w:t>Deliberately NOT in V1</w:t>
       </w:r>
     </w:p>
@@ -3519,7 +3634,7 @@
                 <w:color w:val="FFFFFF"/>
                 <w:sz w:val="19"/>
               </w:rPr>
-              <w:t>Seam already left for V2</w:t>
+              <w:t>How it is parked / seam for a future version</w:t>
             </w:r>
           </w:p>
         </w:tc>
@@ -3553,7 +3668,7 @@
               <w:rPr>
                 <w:sz w:val="19"/>
               </w:rPr>
-              <w:t>AgentFleetManifest, taskGraph, dependsOn already parsed</w:t>
+              <w:t>Removed from v1 schema; friendly error today, re-added under vesper/v2</w:t>
             </w:r>
           </w:p>
         </w:tc>
@@ -3589,7 +3704,7 @@
               <w:rPr>
                 <w:sz w:val="19"/>
               </w:rPr>
-              <w:t>guardrails manifest field validated, unused</w:t>
+              <w:t>guardrails field removed from v1 schema (extra=forbid rejects it)</w:t>
             </w:r>
           </w:p>
         </w:tc>
@@ -3623,7 +3738,7 @@
               <w:rPr>
                 <w:sz w:val="19"/>
               </w:rPr>
-              <w:t>EvalConfig parsed; no execution</w:t>
+              <w:t>EvalConfig removed from v1 schema; re-added in a future version</w:t>
             </w:r>
           </w:p>
         </w:tc>
@@ -3659,7 +3774,7 @@
               <w:rPr>
                 <w:sz w:val="19"/>
               </w:rPr>
-              <w:t>strategy field accepted; truncation fallback</w:t>
+              <w:t>strategy field accepted; truncation fallback in V1</w:t>
             </w:r>
           </w:p>
         </w:tc>
@@ -3816,7 +3931,7 @@
           <w:b w:val="0"/>
           <w:i w:val="0"/>
         </w:rPr>
-        <w:t>Each has a seam already in place (manifest field, exception, or provider hook), so V2 is additive, not a rewrite.</w:t>
+        <w:t>The apiVersion gate makes V2 additive, not a rewrite: widen the schema for the new version, leave the v1 path intact.</w:t>
       </w:r>
     </w:p>
     <w:p>

</xml_diff>